<commit_message>
lệnh bị thiếu dấu -
</commit_message>
<xml_diff>
--- a/Quá trình làm.docx
+++ b/Quá trình làm.docx
@@ -29,8 +29,13 @@
       <w:r>
         <w:t xml:space="preserve">ACTIVE VENV: </w:t>
       </w:r>
-      <w:r>
-        <w:t>venv\Scripts\activate</w:t>
+      <w:proofErr w:type="spellStart"/>
+      <w:r>
+        <w:t>venv</w:t>
+      </w:r>
+      <w:proofErr w:type="spellEnd"/>
+      <w:r>
+        <w:t>\Scripts\activate</w:t>
       </w:r>
     </w:p>
     <w:p>
@@ -44,8 +49,21 @@
       <w:r>
         <w:t xml:space="preserve">LOAD LẠI DỰ ÁN: </w:t>
       </w:r>
-      <w:r>
-        <w:t xml:space="preserve">uvicorn main:app </w:t>
+      <w:proofErr w:type="spellStart"/>
+      <w:r>
+        <w:t>uvicorn</w:t>
+      </w:r>
+      <w:proofErr w:type="spellEnd"/>
+      <w:r>
+        <w:t xml:space="preserve"> </w:t>
+      </w:r>
+      <w:proofErr w:type="spellStart"/>
+      <w:r>
+        <w:t>main:app</w:t>
+      </w:r>
+      <w:proofErr w:type="spellEnd"/>
+      <w:r>
+        <w:t xml:space="preserve"> </w:t>
       </w:r>
       <w:r>
         <w:t>–</w:t>
@@ -71,8 +89,37 @@
       <w:pPr>
         <w:pStyle w:val="Heading2"/>
       </w:pPr>
-      <w:r>
-        <w:t xml:space="preserve">Tải và cài đặt </w:t>
+      <w:proofErr w:type="spellStart"/>
+      <w:r>
+        <w:t>Tải</w:t>
+      </w:r>
+      <w:proofErr w:type="spellEnd"/>
+      <w:r>
+        <w:t xml:space="preserve"> </w:t>
+      </w:r>
+      <w:proofErr w:type="spellStart"/>
+      <w:r>
+        <w:t>và</w:t>
+      </w:r>
+      <w:proofErr w:type="spellEnd"/>
+      <w:r>
+        <w:t xml:space="preserve"> </w:t>
+      </w:r>
+      <w:proofErr w:type="spellStart"/>
+      <w:r>
+        <w:t>cài</w:t>
+      </w:r>
+      <w:proofErr w:type="spellEnd"/>
+      <w:r>
+        <w:t xml:space="preserve"> </w:t>
+      </w:r>
+      <w:proofErr w:type="spellStart"/>
+      <w:r>
+        <w:t>đặt</w:t>
+      </w:r>
+      <w:proofErr w:type="spellEnd"/>
+      <w:r>
+        <w:t xml:space="preserve"> </w:t>
       </w:r>
       <w:r>
         <w:t>python</w:t>
@@ -86,15 +133,43 @@
           <w:numId w:val="20"/>
         </w:numPr>
       </w:pPr>
-      <w:r>
-        <w:t xml:space="preserve">Truy cập đường link </w:t>
-      </w:r>
+      <w:proofErr w:type="spellStart"/>
+      <w:r>
+        <w:t>Truy</w:t>
+      </w:r>
+      <w:proofErr w:type="spellEnd"/>
+      <w:r>
+        <w:t xml:space="preserve"> </w:t>
+      </w:r>
+      <w:proofErr w:type="spellStart"/>
+      <w:r>
+        <w:t>cập</w:t>
+      </w:r>
+      <w:proofErr w:type="spellEnd"/>
+      <w:r>
+        <w:t xml:space="preserve"> </w:t>
+      </w:r>
+      <w:proofErr w:type="spellStart"/>
+      <w:r>
+        <w:t>đường</w:t>
+      </w:r>
+      <w:proofErr w:type="spellEnd"/>
+      <w:r>
+        <w:t xml:space="preserve"> link </w:t>
+      </w:r>
+      <w:proofErr w:type="spellStart"/>
       <w:r>
         <w:t>và</w:t>
       </w:r>
-      <w:r>
-        <w:t xml:space="preserve"> tải</w:t>
-      </w:r>
+      <w:proofErr w:type="spellEnd"/>
+      <w:r>
+        <w:t xml:space="preserve"> </w:t>
+      </w:r>
+      <w:proofErr w:type="spellStart"/>
+      <w:r>
+        <w:t>tải</w:t>
+      </w:r>
+      <w:proofErr w:type="spellEnd"/>
       <w:r>
         <w:t xml:space="preserve">: </w:t>
       </w:r>
@@ -118,8 +193,29 @@
           <w:numId w:val="20"/>
         </w:numPr>
       </w:pPr>
-      <w:r>
-        <w:t xml:space="preserve">Chọn phiên bản: </w:t>
+      <w:proofErr w:type="spellStart"/>
+      <w:r>
+        <w:t>Chọn</w:t>
+      </w:r>
+      <w:proofErr w:type="spellEnd"/>
+      <w:r>
+        <w:t xml:space="preserve"> </w:t>
+      </w:r>
+      <w:proofErr w:type="spellStart"/>
+      <w:r>
+        <w:t>phiên</w:t>
+      </w:r>
+      <w:proofErr w:type="spellEnd"/>
+      <w:r>
+        <w:t xml:space="preserve"> </w:t>
+      </w:r>
+      <w:proofErr w:type="spellStart"/>
+      <w:r>
+        <w:t>bản</w:t>
+      </w:r>
+      <w:proofErr w:type="spellEnd"/>
+      <w:r>
+        <w:t xml:space="preserve">: </w:t>
       </w:r>
     </w:p>
     <w:p>
@@ -176,8 +272,21 @@
           <w:numId w:val="20"/>
         </w:numPr>
       </w:pPr>
-      <w:r>
-        <w:t>Chọn tải file install</w:t>
+      <w:proofErr w:type="spellStart"/>
+      <w:r>
+        <w:t>Chọn</w:t>
+      </w:r>
+      <w:proofErr w:type="spellEnd"/>
+      <w:r>
+        <w:t xml:space="preserve"> </w:t>
+      </w:r>
+      <w:proofErr w:type="spellStart"/>
+      <w:r>
+        <w:t>tải</w:t>
+      </w:r>
+      <w:proofErr w:type="spellEnd"/>
+      <w:r>
+        <w:t xml:space="preserve"> file install</w:t>
       </w:r>
     </w:p>
     <w:p>
@@ -234,17 +343,61 @@
           <w:numId w:val="20"/>
         </w:numPr>
       </w:pPr>
-      <w:r>
-        <w:t>Chọn chỗ lưu là xong</w:t>
-      </w:r>
+      <w:proofErr w:type="spellStart"/>
+      <w:r>
+        <w:t>Chọn</w:t>
+      </w:r>
+      <w:proofErr w:type="spellEnd"/>
+      <w:r>
+        <w:t xml:space="preserve"> </w:t>
+      </w:r>
+      <w:proofErr w:type="spellStart"/>
+      <w:r>
+        <w:t>chỗ</w:t>
+      </w:r>
+      <w:proofErr w:type="spellEnd"/>
+      <w:r>
+        <w:t xml:space="preserve"> </w:t>
+      </w:r>
+      <w:proofErr w:type="spellStart"/>
+      <w:r>
+        <w:t>lưu</w:t>
+      </w:r>
+      <w:proofErr w:type="spellEnd"/>
+      <w:r>
+        <w:t xml:space="preserve"> </w:t>
+      </w:r>
+      <w:proofErr w:type="spellStart"/>
+      <w:r>
+        <w:t>là</w:t>
+      </w:r>
+      <w:proofErr w:type="spellEnd"/>
+      <w:r>
+        <w:t xml:space="preserve"> </w:t>
+      </w:r>
+      <w:proofErr w:type="spellStart"/>
+      <w:r>
+        <w:t>xong</w:t>
+      </w:r>
+      <w:proofErr w:type="spellEnd"/>
     </w:p>
     <w:p>
       <w:pPr>
         <w:pStyle w:val="Heading2"/>
       </w:pPr>
-      <w:r>
-        <w:t>Cài đặt</w:t>
-      </w:r>
+      <w:proofErr w:type="spellStart"/>
+      <w:r>
+        <w:t>Cài</w:t>
+      </w:r>
+      <w:proofErr w:type="spellEnd"/>
+      <w:r>
+        <w:t xml:space="preserve"> </w:t>
+      </w:r>
+      <w:proofErr w:type="spellStart"/>
+      <w:r>
+        <w:t>đặt</w:t>
+      </w:r>
+      <w:proofErr w:type="spellEnd"/>
     </w:p>
     <w:p>
       <w:pPr>
@@ -254,9 +407,27 @@
           <w:numId w:val="20"/>
         </w:numPr>
       </w:pPr>
-      <w:r>
-        <w:t>Mở file vừa tải</w:t>
-      </w:r>
+      <w:proofErr w:type="spellStart"/>
+      <w:r>
+        <w:t>Mở</w:t>
+      </w:r>
+      <w:proofErr w:type="spellEnd"/>
+      <w:r>
+        <w:t xml:space="preserve"> file </w:t>
+      </w:r>
+      <w:proofErr w:type="spellStart"/>
+      <w:r>
+        <w:t>vừa</w:t>
+      </w:r>
+      <w:proofErr w:type="spellEnd"/>
+      <w:r>
+        <w:t xml:space="preserve"> </w:t>
+      </w:r>
+      <w:proofErr w:type="spellStart"/>
+      <w:r>
+        <w:t>tải</w:t>
+      </w:r>
+      <w:proofErr w:type="spellEnd"/>
     </w:p>
     <w:p>
       <w:pPr>
@@ -267,11 +438,40 @@
         </w:numPr>
       </w:pPr>
       <w:r>
-        <w:t>Tick chọn 2 ô</w:t>
-      </w:r>
-      <w:r>
-        <w:t xml:space="preserve"> rồi bấm install now luôn</w:t>
-      </w:r>
+        <w:t xml:space="preserve">Tick </w:t>
+      </w:r>
+      <w:proofErr w:type="spellStart"/>
+      <w:r>
+        <w:t>chọn</w:t>
+      </w:r>
+      <w:proofErr w:type="spellEnd"/>
+      <w:r>
+        <w:t xml:space="preserve"> 2 ô</w:t>
+      </w:r>
+      <w:r>
+        <w:t xml:space="preserve"> </w:t>
+      </w:r>
+      <w:proofErr w:type="spellStart"/>
+      <w:r>
+        <w:t>rồi</w:t>
+      </w:r>
+      <w:proofErr w:type="spellEnd"/>
+      <w:r>
+        <w:t xml:space="preserve"> </w:t>
+      </w:r>
+      <w:proofErr w:type="spellStart"/>
+      <w:r>
+        <w:t>bấm</w:t>
+      </w:r>
+      <w:proofErr w:type="spellEnd"/>
+      <w:r>
+        <w:t xml:space="preserve"> install now </w:t>
+      </w:r>
+      <w:proofErr w:type="spellStart"/>
+      <w:r>
+        <w:t>luôn</w:t>
+      </w:r>
+      <w:proofErr w:type="spellEnd"/>
     </w:p>
     <w:p>
       <w:pPr>
@@ -325,10 +525,28 @@
       <w:pPr>
         <w:pStyle w:val="Heading2"/>
       </w:pPr>
+      <w:proofErr w:type="spellStart"/>
       <w:r>
         <w:lastRenderedPageBreak/>
-        <w:t>Tạo dự án</w:t>
-      </w:r>
+        <w:t>Tạo</w:t>
+      </w:r>
+      <w:proofErr w:type="spellEnd"/>
+      <w:r>
+        <w:t xml:space="preserve"> </w:t>
+      </w:r>
+      <w:proofErr w:type="spellStart"/>
+      <w:r>
+        <w:t>dự</w:t>
+      </w:r>
+      <w:proofErr w:type="spellEnd"/>
+      <w:r>
+        <w:t xml:space="preserve"> </w:t>
+      </w:r>
+      <w:proofErr w:type="spellStart"/>
+      <w:r>
+        <w:t>án</w:t>
+      </w:r>
+      <w:proofErr w:type="spellEnd"/>
     </w:p>
     <w:p>
       <w:pPr>
@@ -338,9 +556,27 @@
           <w:numId w:val="20"/>
         </w:numPr>
       </w:pPr>
-      <w:r>
-        <w:t>Tạo thư mục</w:t>
-      </w:r>
+      <w:proofErr w:type="spellStart"/>
+      <w:r>
+        <w:t>Tạo</w:t>
+      </w:r>
+      <w:proofErr w:type="spellEnd"/>
+      <w:r>
+        <w:t xml:space="preserve"> </w:t>
+      </w:r>
+      <w:proofErr w:type="spellStart"/>
+      <w:r>
+        <w:t>thư</w:t>
+      </w:r>
+      <w:proofErr w:type="spellEnd"/>
+      <w:r>
+        <w:t xml:space="preserve"> </w:t>
+      </w:r>
+      <w:proofErr w:type="spellStart"/>
+      <w:r>
+        <w:t>mục</w:t>
+      </w:r>
+      <w:proofErr w:type="spellEnd"/>
     </w:p>
     <w:p>
       <w:pPr>
@@ -350,15 +586,121 @@
           <w:numId w:val="20"/>
         </w:numPr>
       </w:pPr>
-      <w:r>
-        <w:t>Vào cmt tạo môi trường riêng cho dự án (thư mục venv)</w:t>
+      <w:proofErr w:type="spellStart"/>
+      <w:r>
+        <w:t>Vào</w:t>
+      </w:r>
+      <w:proofErr w:type="spellEnd"/>
+      <w:r>
+        <w:t xml:space="preserve"> </w:t>
+      </w:r>
+      <w:proofErr w:type="spellStart"/>
+      <w:r>
+        <w:t>cmt</w:t>
+      </w:r>
+      <w:proofErr w:type="spellEnd"/>
+      <w:r>
+        <w:t xml:space="preserve"> </w:t>
+      </w:r>
+      <w:proofErr w:type="spellStart"/>
+      <w:r>
+        <w:t>tạo</w:t>
+      </w:r>
+      <w:proofErr w:type="spellEnd"/>
+      <w:r>
+        <w:t xml:space="preserve"> </w:t>
+      </w:r>
+      <w:proofErr w:type="spellStart"/>
+      <w:r>
+        <w:t>môi</w:t>
+      </w:r>
+      <w:proofErr w:type="spellEnd"/>
+      <w:r>
+        <w:t xml:space="preserve"> </w:t>
+      </w:r>
+      <w:proofErr w:type="spellStart"/>
+      <w:r>
+        <w:t>trường</w:t>
+      </w:r>
+      <w:proofErr w:type="spellEnd"/>
+      <w:r>
+        <w:t xml:space="preserve"> </w:t>
+      </w:r>
+      <w:proofErr w:type="spellStart"/>
+      <w:r>
+        <w:t>riêng</w:t>
+      </w:r>
+      <w:proofErr w:type="spellEnd"/>
+      <w:r>
+        <w:t xml:space="preserve"> </w:t>
+      </w:r>
+      <w:proofErr w:type="spellStart"/>
+      <w:r>
+        <w:t>cho</w:t>
+      </w:r>
+      <w:proofErr w:type="spellEnd"/>
+      <w:r>
+        <w:t xml:space="preserve"> </w:t>
+      </w:r>
+      <w:proofErr w:type="spellStart"/>
+      <w:r>
+        <w:t>dự</w:t>
+      </w:r>
+      <w:proofErr w:type="spellEnd"/>
+      <w:r>
+        <w:t xml:space="preserve"> </w:t>
+      </w:r>
+      <w:proofErr w:type="spellStart"/>
+      <w:r>
+        <w:t>án</w:t>
+      </w:r>
+      <w:proofErr w:type="spellEnd"/>
+      <w:r>
+        <w:t xml:space="preserve"> (</w:t>
+      </w:r>
+      <w:proofErr w:type="spellStart"/>
+      <w:r>
+        <w:t>thư</w:t>
+      </w:r>
+      <w:proofErr w:type="spellEnd"/>
+      <w:r>
+        <w:t xml:space="preserve"> </w:t>
+      </w:r>
+      <w:proofErr w:type="spellStart"/>
+      <w:r>
+        <w:t>mục</w:t>
+      </w:r>
+      <w:proofErr w:type="spellEnd"/>
+      <w:r>
+        <w:t xml:space="preserve"> </w:t>
+      </w:r>
+      <w:proofErr w:type="spellStart"/>
+      <w:r>
+        <w:t>venv</w:t>
+      </w:r>
+      <w:proofErr w:type="spellEnd"/>
+      <w:r>
+        <w:t>)</w:t>
       </w:r>
       <w:r>
         <w:t xml:space="preserve">: </w:t>
       </w:r>
       <w:r>
-        <w:t>python -m venv venv</w:t>
-      </w:r>
+        <w:t xml:space="preserve">python -m </w:t>
+      </w:r>
+      <w:proofErr w:type="spellStart"/>
+      <w:r>
+        <w:t>venv</w:t>
+      </w:r>
+      <w:proofErr w:type="spellEnd"/>
+      <w:r>
+        <w:t xml:space="preserve"> </w:t>
+      </w:r>
+      <w:proofErr w:type="spellStart"/>
+      <w:r>
+        <w:t>venv</w:t>
+      </w:r>
+      <w:proofErr w:type="spellEnd"/>
     </w:p>
     <w:p>
       <w:pPr>
@@ -413,14 +755,37 @@
           <w:numId w:val="20"/>
         </w:numPr>
       </w:pPr>
-      <w:r>
-        <w:t>Kích hoạt venv</w:t>
-      </w:r>
+      <w:proofErr w:type="spellStart"/>
+      <w:r>
+        <w:t>Kích</w:t>
+      </w:r>
+      <w:proofErr w:type="spellEnd"/>
+      <w:r>
+        <w:t xml:space="preserve"> </w:t>
+      </w:r>
+      <w:proofErr w:type="spellStart"/>
+      <w:r>
+        <w:t>hoạt</w:t>
+      </w:r>
+      <w:proofErr w:type="spellEnd"/>
+      <w:r>
+        <w:t xml:space="preserve"> </w:t>
+      </w:r>
+      <w:proofErr w:type="spellStart"/>
+      <w:r>
+        <w:t>venv</w:t>
+      </w:r>
+      <w:proofErr w:type="spellEnd"/>
       <w:r>
         <w:t xml:space="preserve">: </w:t>
       </w:r>
-      <w:r>
-        <w:t>venv\Scripts\activate</w:t>
+      <w:proofErr w:type="spellStart"/>
+      <w:r>
+        <w:t>venv</w:t>
+      </w:r>
+      <w:proofErr w:type="spellEnd"/>
+      <w:r>
+        <w:t>\Scripts\activate</w:t>
       </w:r>
       <w:r>
         <w:t xml:space="preserve"> </w:t>
@@ -475,23 +840,48 @@
       <w:pPr>
         <w:pStyle w:val="Heading2"/>
       </w:pPr>
-      <w:r>
-        <w:t>Cài đặt edge</w:t>
+      <w:proofErr w:type="spellStart"/>
+      <w:r>
+        <w:t>Cài</w:t>
+      </w:r>
+      <w:proofErr w:type="spellEnd"/>
+      <w:r>
+        <w:t xml:space="preserve"> </w:t>
+      </w:r>
+      <w:proofErr w:type="spellStart"/>
+      <w:r>
+        <w:t>đặt</w:t>
+      </w:r>
+      <w:proofErr w:type="spellEnd"/>
+      <w:r>
+        <w:t xml:space="preserve"> edge</w:t>
       </w:r>
       <w:r>
         <w:t>-</w:t>
       </w:r>
+      <w:proofErr w:type="spellStart"/>
       <w:r>
         <w:t>tts</w:t>
       </w:r>
-    </w:p>
-    <w:p>
-      <w:r>
-        <w:t xml:space="preserve">Lệnh: </w:t>
-      </w:r>
-      <w:r>
-        <w:t>pip install edge-tts</w:t>
-      </w:r>
+      <w:proofErr w:type="spellEnd"/>
+    </w:p>
+    <w:p>
+      <w:proofErr w:type="spellStart"/>
+      <w:r>
+        <w:t>Lệnh</w:t>
+      </w:r>
+      <w:proofErr w:type="spellEnd"/>
+      <w:r>
+        <w:t xml:space="preserve">: </w:t>
+      </w:r>
+      <w:r>
+        <w:t>pip install edge-</w:t>
+      </w:r>
+      <w:proofErr w:type="spellStart"/>
+      <w:r>
+        <w:t>tts</w:t>
+      </w:r>
+      <w:proofErr w:type="spellEnd"/>
     </w:p>
     <w:p>
       <w:r>
@@ -541,12 +931,164 @@
         <w:pStyle w:val="Heading2"/>
       </w:pPr>
       <w:r>
-        <w:t>Test EDGE TTS bằng lệnh cmd tạo file mp3</w:t>
-      </w:r>
-    </w:p>
-    <w:p>
-      <w:r>
-        <w:t>edge-tts --voice vi-VN-HoaiMyNeural --text "Xin chào, đây là chương trình chuyển văn bản thành giọng nói của tôi." --write-media test.mp3</w:t>
+        <w:t xml:space="preserve">Test EDGE TTS </w:t>
+      </w:r>
+      <w:proofErr w:type="spellStart"/>
+      <w:r>
+        <w:t>bằng</w:t>
+      </w:r>
+      <w:proofErr w:type="spellEnd"/>
+      <w:r>
+        <w:t xml:space="preserve"> </w:t>
+      </w:r>
+      <w:proofErr w:type="spellStart"/>
+      <w:r>
+        <w:t>lệnh</w:t>
+      </w:r>
+      <w:proofErr w:type="spellEnd"/>
+      <w:r>
+        <w:t xml:space="preserve"> </w:t>
+      </w:r>
+      <w:proofErr w:type="spellStart"/>
+      <w:r>
+        <w:t>cmd</w:t>
+      </w:r>
+      <w:proofErr w:type="spellEnd"/>
+      <w:r>
+        <w:t xml:space="preserve"> </w:t>
+      </w:r>
+      <w:proofErr w:type="spellStart"/>
+      <w:r>
+        <w:t>tạo</w:t>
+      </w:r>
+      <w:proofErr w:type="spellEnd"/>
+      <w:r>
+        <w:t xml:space="preserve"> file mp3</w:t>
+      </w:r>
+    </w:p>
+    <w:p>
+      <w:r>
+        <w:t>edge-</w:t>
+      </w:r>
+      <w:proofErr w:type="spellStart"/>
+      <w:r>
+        <w:t>tts</w:t>
+      </w:r>
+      <w:proofErr w:type="spellEnd"/>
+      <w:r>
+        <w:t xml:space="preserve"> --voice vi-VN-</w:t>
+      </w:r>
+      <w:proofErr w:type="spellStart"/>
+      <w:r>
+        <w:t>HoaiMyNeural</w:t>
+      </w:r>
+      <w:proofErr w:type="spellEnd"/>
+      <w:r>
+        <w:t xml:space="preserve"> --text "Xin </w:t>
+      </w:r>
+      <w:proofErr w:type="spellStart"/>
+      <w:r>
+        <w:t>chào</w:t>
+      </w:r>
+      <w:proofErr w:type="spellEnd"/>
+      <w:r>
+        <w:t xml:space="preserve">, </w:t>
+      </w:r>
+      <w:proofErr w:type="spellStart"/>
+      <w:r>
+        <w:t>đây</w:t>
+      </w:r>
+      <w:proofErr w:type="spellEnd"/>
+      <w:r>
+        <w:t xml:space="preserve"> </w:t>
+      </w:r>
+      <w:proofErr w:type="spellStart"/>
+      <w:r>
+        <w:t>là</w:t>
+      </w:r>
+      <w:proofErr w:type="spellEnd"/>
+      <w:r>
+        <w:t xml:space="preserve"> </w:t>
+      </w:r>
+      <w:proofErr w:type="spellStart"/>
+      <w:r>
+        <w:t>chương</w:t>
+      </w:r>
+      <w:proofErr w:type="spellEnd"/>
+      <w:r>
+        <w:t xml:space="preserve"> </w:t>
+      </w:r>
+      <w:proofErr w:type="spellStart"/>
+      <w:r>
+        <w:t>trình</w:t>
+      </w:r>
+      <w:proofErr w:type="spellEnd"/>
+      <w:r>
+        <w:t xml:space="preserve"> </w:t>
+      </w:r>
+      <w:proofErr w:type="spellStart"/>
+      <w:r>
+        <w:t>chuyển</w:t>
+      </w:r>
+      <w:proofErr w:type="spellEnd"/>
+      <w:r>
+        <w:t xml:space="preserve"> </w:t>
+      </w:r>
+      <w:proofErr w:type="spellStart"/>
+      <w:r>
+        <w:t>văn</w:t>
+      </w:r>
+      <w:proofErr w:type="spellEnd"/>
+      <w:r>
+        <w:t xml:space="preserve"> </w:t>
+      </w:r>
+      <w:proofErr w:type="spellStart"/>
+      <w:r>
+        <w:t>bản</w:t>
+      </w:r>
+      <w:proofErr w:type="spellEnd"/>
+      <w:r>
+        <w:t xml:space="preserve"> </w:t>
+      </w:r>
+      <w:proofErr w:type="spellStart"/>
+      <w:r>
+        <w:t>thành</w:t>
+      </w:r>
+      <w:proofErr w:type="spellEnd"/>
+      <w:r>
+        <w:t xml:space="preserve"> </w:t>
+      </w:r>
+      <w:proofErr w:type="spellStart"/>
+      <w:r>
+        <w:t>giọng</w:t>
+      </w:r>
+      <w:proofErr w:type="spellEnd"/>
+      <w:r>
+        <w:t xml:space="preserve"> </w:t>
+      </w:r>
+      <w:proofErr w:type="spellStart"/>
+      <w:r>
+        <w:t>nói</w:t>
+      </w:r>
+      <w:proofErr w:type="spellEnd"/>
+      <w:r>
+        <w:t xml:space="preserve"> </w:t>
+      </w:r>
+      <w:proofErr w:type="spellStart"/>
+      <w:r>
+        <w:t>của</w:t>
+      </w:r>
+      <w:proofErr w:type="spellEnd"/>
+      <w:r>
+        <w:t xml:space="preserve"> </w:t>
+      </w:r>
+      <w:proofErr w:type="spellStart"/>
+      <w:r>
+        <w:t>tôi</w:t>
+      </w:r>
+      <w:proofErr w:type="spellEnd"/>
+      <w:r>
+        <w:t>." --write-media test.mp3</w:t>
       </w:r>
       <w:r>
         <w:t xml:space="preserve"> </w:t>
@@ -556,9 +1098,43 @@
       <w:pPr>
         <w:pStyle w:val="Heading2"/>
       </w:pPr>
-      <w:r>
-        <w:t>Tạo cấu trúc thư mục</w:t>
-      </w:r>
+      <w:proofErr w:type="spellStart"/>
+      <w:r>
+        <w:t>Tạo</w:t>
+      </w:r>
+      <w:proofErr w:type="spellEnd"/>
+      <w:r>
+        <w:t xml:space="preserve"> </w:t>
+      </w:r>
+      <w:proofErr w:type="spellStart"/>
+      <w:r>
+        <w:t>cấu</w:t>
+      </w:r>
+      <w:proofErr w:type="spellEnd"/>
+      <w:r>
+        <w:t xml:space="preserve"> </w:t>
+      </w:r>
+      <w:proofErr w:type="spellStart"/>
+      <w:r>
+        <w:t>trúc</w:t>
+      </w:r>
+      <w:proofErr w:type="spellEnd"/>
+      <w:r>
+        <w:t xml:space="preserve"> </w:t>
+      </w:r>
+      <w:proofErr w:type="spellStart"/>
+      <w:r>
+        <w:t>thư</w:t>
+      </w:r>
+      <w:proofErr w:type="spellEnd"/>
+      <w:r>
+        <w:t xml:space="preserve"> </w:t>
+      </w:r>
+      <w:proofErr w:type="spellStart"/>
+      <w:r>
+        <w:t>mục</w:t>
+      </w:r>
+      <w:proofErr w:type="spellEnd"/>
     </w:p>
     <w:p>
       <w:r>
@@ -606,9 +1182,31 @@
       <w:pPr>
         <w:pStyle w:val="Heading2"/>
       </w:pPr>
-      <w:r>
-        <w:t xml:space="preserve">Cài FastAPI và </w:t>
-      </w:r>
+      <w:proofErr w:type="spellStart"/>
+      <w:r>
+        <w:t>Cài</w:t>
+      </w:r>
+      <w:proofErr w:type="spellEnd"/>
+      <w:r>
+        <w:t xml:space="preserve"> </w:t>
+      </w:r>
+      <w:proofErr w:type="spellStart"/>
+      <w:r>
+        <w:t>FastAPI</w:t>
+      </w:r>
+      <w:proofErr w:type="spellEnd"/>
+      <w:r>
+        <w:t xml:space="preserve"> </w:t>
+      </w:r>
+      <w:proofErr w:type="spellStart"/>
+      <w:r>
+        <w:t>và</w:t>
+      </w:r>
+      <w:proofErr w:type="spellEnd"/>
+      <w:r>
+        <w:t xml:space="preserve"> </w:t>
+      </w:r>
+      <w:proofErr w:type="spellStart"/>
       <w:r>
         <w:t>U</w:t>
       </w:r>
@@ -618,14 +1216,33 @@
       <w:r>
         <w:t>icorn</w:t>
       </w:r>
-    </w:p>
-    <w:p>
-      <w:r>
-        <w:t xml:space="preserve">Lệnh: </w:t>
-      </w:r>
-      <w:r>
-        <w:t>pip install fastapi uvicorn</w:t>
-      </w:r>
+      <w:proofErr w:type="spellEnd"/>
+    </w:p>
+    <w:p>
+      <w:proofErr w:type="spellStart"/>
+      <w:r>
+        <w:t>Lệnh</w:t>
+      </w:r>
+      <w:proofErr w:type="spellEnd"/>
+      <w:r>
+        <w:t xml:space="preserve">: </w:t>
+      </w:r>
+      <w:r>
+        <w:t xml:space="preserve">pip install </w:t>
+      </w:r>
+      <w:proofErr w:type="spellStart"/>
+      <w:r>
+        <w:t>fastapi</w:t>
+      </w:r>
+      <w:proofErr w:type="spellEnd"/>
+      <w:r>
+        <w:t xml:space="preserve"> </w:t>
+      </w:r>
+      <w:proofErr w:type="spellStart"/>
+      <w:r>
+        <w:t>uvicorn</w:t>
+      </w:r>
+      <w:proofErr w:type="spellEnd"/>
     </w:p>
     <w:p>
       <w:r>
@@ -675,15 +1292,41 @@
         <w:pStyle w:val="Heading2"/>
       </w:pPr>
       <w:r>
-        <w:t>Run dự án</w:t>
-      </w:r>
-    </w:p>
-    <w:p>
-      <w:r>
-        <w:t xml:space="preserve">uvicorn main:app </w:t>
-      </w:r>
-      <w:r>
-        <w:t>–</w:t>
+        <w:t xml:space="preserve">Run </w:t>
+      </w:r>
+      <w:proofErr w:type="spellStart"/>
+      <w:r>
+        <w:t>dự</w:t>
+      </w:r>
+      <w:proofErr w:type="spellEnd"/>
+      <w:r>
+        <w:t xml:space="preserve"> </w:t>
+      </w:r>
+      <w:proofErr w:type="spellStart"/>
+      <w:r>
+        <w:t>án</w:t>
+      </w:r>
+      <w:proofErr w:type="spellEnd"/>
+    </w:p>
+    <w:p>
+      <w:proofErr w:type="spellStart"/>
+      <w:r>
+        <w:t>uvicorn</w:t>
+      </w:r>
+      <w:proofErr w:type="spellEnd"/>
+      <w:r>
+        <w:t xml:space="preserve"> </w:t>
+      </w:r>
+      <w:proofErr w:type="spellStart"/>
+      <w:r>
+        <w:t>main:app</w:t>
+      </w:r>
+      <w:proofErr w:type="spellEnd"/>
+      <w:r>
+        <w:t xml:space="preserve"> </w:t>
+      </w:r>
+      <w:r>
+        <w:t>--</w:t>
       </w:r>
       <w:r>
         <w:t>reload</w:t>
@@ -735,9 +1378,35 @@
       <w:pPr>
         <w:pStyle w:val="Heading2"/>
       </w:pPr>
-      <w:r>
-        <w:t>Cài thêm thư viện</w:t>
-      </w:r>
+      <w:proofErr w:type="spellStart"/>
+      <w:r>
+        <w:t>Cài</w:t>
+      </w:r>
+      <w:proofErr w:type="spellEnd"/>
+      <w:r>
+        <w:t xml:space="preserve"> </w:t>
+      </w:r>
+      <w:proofErr w:type="spellStart"/>
+      <w:r>
+        <w:t>thêm</w:t>
+      </w:r>
+      <w:proofErr w:type="spellEnd"/>
+      <w:r>
+        <w:t xml:space="preserve"> </w:t>
+      </w:r>
+      <w:proofErr w:type="spellStart"/>
+      <w:r>
+        <w:t>thư</w:t>
+      </w:r>
+      <w:proofErr w:type="spellEnd"/>
+      <w:r>
+        <w:t xml:space="preserve"> </w:t>
+      </w:r>
+      <w:proofErr w:type="spellStart"/>
+      <w:r>
+        <w:t>viện</w:t>
+      </w:r>
+      <w:proofErr w:type="spellEnd"/>
       <w:r>
         <w:t>.</w:t>
       </w:r>
@@ -751,22 +1420,157 @@
       <w:pPr>
         <w:pStyle w:val="Heading1"/>
       </w:pPr>
-      <w:r>
-        <w:t>Các lệnh cmd cài thêm thư viện hỗ trợ</w:t>
-      </w:r>
+      <w:proofErr w:type="spellStart"/>
+      <w:r>
+        <w:t>Các</w:t>
+      </w:r>
+      <w:proofErr w:type="spellEnd"/>
+      <w:r>
+        <w:t xml:space="preserve"> </w:t>
+      </w:r>
+      <w:proofErr w:type="spellStart"/>
+      <w:r>
+        <w:t>lệnh</w:t>
+      </w:r>
+      <w:proofErr w:type="spellEnd"/>
+      <w:r>
+        <w:t xml:space="preserve"> </w:t>
+      </w:r>
+      <w:proofErr w:type="spellStart"/>
+      <w:r>
+        <w:t>cmd</w:t>
+      </w:r>
+      <w:proofErr w:type="spellEnd"/>
+      <w:r>
+        <w:t xml:space="preserve"> </w:t>
+      </w:r>
+      <w:proofErr w:type="spellStart"/>
+      <w:r>
+        <w:t>cài</w:t>
+      </w:r>
+      <w:proofErr w:type="spellEnd"/>
+      <w:r>
+        <w:t xml:space="preserve"> </w:t>
+      </w:r>
+      <w:proofErr w:type="spellStart"/>
+      <w:r>
+        <w:t>thêm</w:t>
+      </w:r>
+      <w:proofErr w:type="spellEnd"/>
+      <w:r>
+        <w:t xml:space="preserve"> </w:t>
+      </w:r>
+      <w:proofErr w:type="spellStart"/>
+      <w:r>
+        <w:t>thư</w:t>
+      </w:r>
+      <w:proofErr w:type="spellEnd"/>
+      <w:r>
+        <w:t xml:space="preserve"> </w:t>
+      </w:r>
+      <w:proofErr w:type="spellStart"/>
+      <w:r>
+        <w:t>viện</w:t>
+      </w:r>
+      <w:proofErr w:type="spellEnd"/>
+      <w:r>
+        <w:t xml:space="preserve"> </w:t>
+      </w:r>
+      <w:proofErr w:type="spellStart"/>
+      <w:r>
+        <w:t>hỗ</w:t>
+      </w:r>
+      <w:proofErr w:type="spellEnd"/>
+      <w:r>
+        <w:t xml:space="preserve"> </w:t>
+      </w:r>
+      <w:proofErr w:type="spellStart"/>
+      <w:r>
+        <w:t>trợ</w:t>
+      </w:r>
+      <w:proofErr w:type="spellEnd"/>
     </w:p>
     <w:p>
       <w:pPr>
         <w:pStyle w:val="Heading2"/>
       </w:pPr>
-      <w:r>
-        <w:t>Lệnh cài thư viện “</w:t>
+      <w:proofErr w:type="spellStart"/>
+      <w:r>
+        <w:t>Lệnh</w:t>
+      </w:r>
+      <w:proofErr w:type="spellEnd"/>
+      <w:r>
+        <w:t xml:space="preserve"> </w:t>
+      </w:r>
+      <w:proofErr w:type="spellStart"/>
+      <w:r>
+        <w:t>cài</w:t>
+      </w:r>
+      <w:proofErr w:type="spellEnd"/>
+      <w:r>
+        <w:t xml:space="preserve"> </w:t>
+      </w:r>
+      <w:proofErr w:type="spellStart"/>
+      <w:r>
+        <w:t>thư</w:t>
+      </w:r>
+      <w:proofErr w:type="spellEnd"/>
+      <w:r>
+        <w:t xml:space="preserve"> </w:t>
+      </w:r>
+      <w:proofErr w:type="spellStart"/>
+      <w:r>
+        <w:t>viện</w:t>
+      </w:r>
+      <w:proofErr w:type="spellEnd"/>
+      <w:r>
+        <w:t xml:space="preserve"> “</w:t>
       </w:r>
       <w:r>
         <w:t>python-docx</w:t>
       </w:r>
       <w:r>
-        <w:t>” để hỗ trợ đọc ghi file word</w:t>
+        <w:t xml:space="preserve">” </w:t>
+      </w:r>
+      <w:proofErr w:type="spellStart"/>
+      <w:r>
+        <w:t>để</w:t>
+      </w:r>
+      <w:proofErr w:type="spellEnd"/>
+      <w:r>
+        <w:t xml:space="preserve"> </w:t>
+      </w:r>
+      <w:proofErr w:type="spellStart"/>
+      <w:r>
+        <w:t>hỗ</w:t>
+      </w:r>
+      <w:proofErr w:type="spellEnd"/>
+      <w:r>
+        <w:t xml:space="preserve"> </w:t>
+      </w:r>
+      <w:proofErr w:type="spellStart"/>
+      <w:r>
+        <w:t>trợ</w:t>
+      </w:r>
+      <w:proofErr w:type="spellEnd"/>
+      <w:r>
+        <w:t xml:space="preserve"> </w:t>
+      </w:r>
+      <w:proofErr w:type="spellStart"/>
+      <w:r>
+        <w:t>đọc</w:t>
+      </w:r>
+      <w:proofErr w:type="spellEnd"/>
+      <w:r>
+        <w:t xml:space="preserve"> </w:t>
+      </w:r>
+      <w:proofErr w:type="spellStart"/>
+      <w:r>
+        <w:t>ghi</w:t>
+      </w:r>
+      <w:proofErr w:type="spellEnd"/>
+      <w:r>
+        <w:t xml:space="preserve"> file word</w:t>
       </w:r>
     </w:p>
     <w:p>
@@ -777,8 +1581,13 @@
           <w:numId w:val="20"/>
         </w:numPr>
       </w:pPr>
-      <w:r>
-        <w:t>venv\Scripts\pip install python-docx</w:t>
+      <w:proofErr w:type="spellStart"/>
+      <w:r>
+        <w:t>venv</w:t>
+      </w:r>
+      <w:proofErr w:type="spellEnd"/>
+      <w:r>
+        <w:t>\Scripts\pip install python-docx</w:t>
       </w:r>
     </w:p>
     <w:p>
@@ -825,98 +1634,6 @@
       </w:r>
     </w:p>
     <w:p/>
-    <w:p>
-      <w:pPr>
-        <w:pStyle w:val="Heading1"/>
-      </w:pPr>
-      <w:r>
-        <w:t>DANH SÁCH LỆNH THÔ KHÔNG HÌNH ẢNH</w:t>
-      </w:r>
-    </w:p>
-    <w:p>
-      <w:pPr>
-        <w:pStyle w:val="ListParagraph"/>
-        <w:numPr>
-          <w:ilvl w:val="0"/>
-          <w:numId w:val="20"/>
-        </w:numPr>
-      </w:pPr>
-      <w:r>
-        <w:t>python -m venv venv</w:t>
-      </w:r>
-    </w:p>
-    <w:p>
-      <w:pPr>
-        <w:pStyle w:val="ListParagraph"/>
-        <w:numPr>
-          <w:ilvl w:val="0"/>
-          <w:numId w:val="20"/>
-        </w:numPr>
-      </w:pPr>
-      <w:r>
-        <w:t>venv\Scripts\activate</w:t>
-      </w:r>
-    </w:p>
-    <w:p>
-      <w:pPr>
-        <w:pStyle w:val="ListParagraph"/>
-        <w:numPr>
-          <w:ilvl w:val="0"/>
-          <w:numId w:val="20"/>
-        </w:numPr>
-      </w:pPr>
-      <w:r>
-        <w:t>pip install edge-tts</w:t>
-      </w:r>
-    </w:p>
-    <w:p>
-      <w:pPr>
-        <w:pStyle w:val="ListParagraph"/>
-        <w:numPr>
-          <w:ilvl w:val="0"/>
-          <w:numId w:val="20"/>
-        </w:numPr>
-      </w:pPr>
-      <w:r>
-        <w:t>edge-tts --voice vi-VN-HoaiMyNeural --text "Xin chào, đây là chương trình chuyển văn bản thành giọng nói của tôi." --write-media test.mp3</w:t>
-      </w:r>
-    </w:p>
-    <w:p>
-      <w:pPr>
-        <w:pStyle w:val="ListParagraph"/>
-        <w:numPr>
-          <w:ilvl w:val="0"/>
-          <w:numId w:val="20"/>
-        </w:numPr>
-      </w:pPr>
-      <w:r>
-        <w:t>pip install fastapi uvicorn</w:t>
-      </w:r>
-    </w:p>
-    <w:p>
-      <w:pPr>
-        <w:pStyle w:val="ListParagraph"/>
-        <w:numPr>
-          <w:ilvl w:val="0"/>
-          <w:numId w:val="20"/>
-        </w:numPr>
-      </w:pPr>
-      <w:r>
-        <w:t>uvicorn main:app --reload</w:t>
-      </w:r>
-    </w:p>
-    <w:p>
-      <w:pPr>
-        <w:pStyle w:val="ListParagraph"/>
-        <w:numPr>
-          <w:ilvl w:val="0"/>
-          <w:numId w:val="20"/>
-        </w:numPr>
-      </w:pPr>
-      <w:r>
-        <w:t>pip install python-multipart</w:t>
-      </w:r>
-    </w:p>
     <w:sectPr>
       <w:pgSz w:w="12240" w:h="15840"/>
       <w:pgMar w:top="1134" w:right="1134" w:bottom="1134" w:left="1701" w:header="709" w:footer="709" w:gutter="0"/>
@@ -2099,6 +2816,7 @@
   <w:style w:type="character" w:default="1" w:styleId="DefaultParagraphFont">
     <w:name w:val="Default Paragraph Font"/>
     <w:uiPriority w:val="1"/>
+    <w:semiHidden/>
     <w:unhideWhenUsed/>
   </w:style>
   <w:style w:type="table" w:default="1" w:styleId="TableNormal">

</xml_diff>